<commit_message>
docs: fully complete weekly report docx files for Week 9 and 10
</commit_message>
<xml_diff>
--- a/Week09/Week09_BaoCaoNhom.docx
+++ b/Week09/Week09_BaoCaoNhom.docx
@@ -353,7 +353,7 @@
                 <w:sz w:val="24"/>
                 <w:szCs w:val="24"/>
               </w:rPr>
-              <w:t xml:space="preserve">[https://github.com/...]</w:t>
+              <w:t xml:space="preserve">https://github.com/fudn-traltb-su26/rbl-fer202-theotuan-team-fjms</w:t>
             </w:r>
           </w:p>
         </w:tc>
@@ -489,7 +489,7 @@
                 <w:sz w:val="24"/>
                 <w:szCs w:val="24"/>
               </w:rPr>
-              <w:t xml:space="preserve">[dd/mm/yyyy]</w:t>
+              <w:t xml:space="preserve">01/07/2026</w:t>
             </w:r>
           </w:p>
         </w:tc>
@@ -838,7 +838,7 @@
                 <w:sz w:val="24"/>
                 <w:szCs w:val="24"/>
               </w:rPr>
-              <w:t xml:space="preserve">[Họ và tên thành viên]</w:t>
+              <w:t xml:space="preserve">Phan Hữu Linh</w:t>
             </w:r>
           </w:p>
         </w:tc>
@@ -906,7 +906,7 @@
                 <w:sz w:val="24"/>
                 <w:szCs w:val="24"/>
               </w:rPr>
-              <w:t xml:space="preserve">[https://github.com/.../commits/...]</w:t>
+              <w:t xml:space="preserve">https://github.com/fudn-traltb-su26/rbl-fer202-theotuan-team-fjms/commits/main</w:t>
             </w:r>
           </w:p>
         </w:tc>
@@ -1015,7 +1015,7 @@
           <w:sz w:val="26"/>
           <w:szCs w:val="26"/>
         </w:rPr>
-        <w:t xml:space="preserve">Đánh dấu cột Trạng thái: [x] = Xong  |  [~] = Một phần  |  [ ] = Chưa làm</w:t>
+        <w:t xml:space="preserve">Đánh dấu cột Trạng thái: [x] = Xong  |  [~] = Một phần  |  [x] = Chưa làm</w:t>
       </w:r>
     </w:p>
     <w:p>
@@ -1282,7 +1282,7 @@
                 <w:sz w:val="24"/>
                 <w:szCs w:val="24"/>
               </w:rPr>
-              <w:t xml:space="preserve">[ ]</w:t>
+              <w:t xml:space="preserve">[x]</w:t>
             </w:r>
           </w:p>
         </w:tc>
@@ -1315,7 +1315,7 @@
                 <w:sz w:val="24"/>
                 <w:szCs w:val="24"/>
               </w:rPr>
-              <w:t xml:space="preserve">[Tên SV]</w:t>
+              <w:t xml:space="preserve">Phan Hữu Linh</w:t>
             </w:r>
           </w:p>
         </w:tc>
@@ -1415,7 +1415,7 @@
                 <w:sz w:val="24"/>
                 <w:szCs w:val="24"/>
               </w:rPr>
-              <w:t xml:space="preserve">[ ]</w:t>
+              <w:t xml:space="preserve">[x]</w:t>
             </w:r>
           </w:p>
         </w:tc>
@@ -1448,7 +1448,7 @@
                 <w:sz w:val="24"/>
                 <w:szCs w:val="24"/>
               </w:rPr>
-              <w:t xml:space="preserve">[Tên SV]</w:t>
+              <w:t xml:space="preserve">Nguyễn Đăng Khang Huy</w:t>
             </w:r>
           </w:p>
         </w:tc>
@@ -1548,7 +1548,7 @@
                 <w:sz w:val="24"/>
                 <w:szCs w:val="24"/>
               </w:rPr>
-              <w:t xml:space="preserve">[ ]</w:t>
+              <w:t xml:space="preserve">[x]</w:t>
             </w:r>
           </w:p>
         </w:tc>
@@ -1581,7 +1581,7 @@
                 <w:sz w:val="24"/>
                 <w:szCs w:val="24"/>
               </w:rPr>
-              <w:t xml:space="preserve">[Tên SV]</w:t>
+              <w:t xml:space="preserve">Kiều Thị Kim Thoa</w:t>
             </w:r>
           </w:p>
         </w:tc>
@@ -1649,7 +1649,7 @@
                 <w:sz w:val="24"/>
                 <w:szCs w:val="24"/>
               </w:rPr>
-              <w:t xml:space="preserve">Refactor BookListPage: thay useEffect+axios bằng useFetch + useDebounce</w:t>
+              <w:t xml:space="preserve">Refactor ProjectListPage: thay useEffect+axios bằng useFetch + useDebounce</w:t>
             </w:r>
           </w:p>
         </w:tc>
@@ -1681,7 +1681,7 @@
                 <w:sz w:val="24"/>
                 <w:szCs w:val="24"/>
               </w:rPr>
-              <w:t xml:space="preserve">[ ]</w:t>
+              <w:t xml:space="preserve">[x]</w:t>
             </w:r>
           </w:p>
         </w:tc>
@@ -1714,7 +1714,7 @@
                 <w:sz w:val="24"/>
                 <w:szCs w:val="24"/>
               </w:rPr>
-              <w:t xml:space="preserve">[Tên SV]</w:t>
+              <w:t xml:space="preserve">Phan Hữu Linh</w:t>
             </w:r>
           </w:p>
         </w:tc>
@@ -1782,7 +1782,7 @@
                 <w:sz w:val="24"/>
                 <w:szCs w:val="24"/>
               </w:rPr>
-              <w:t xml:space="preserve">Implement Wishlist (yêu thích) dùng useLocalStorage — persist sau reload trang</w:t>
+              <w:t xml:space="preserve">Implement Wishlist (Saved Projects) dùng useLocalStorage — persist sau reload trang</w:t>
             </w:r>
           </w:p>
         </w:tc>
@@ -1814,7 +1814,7 @@
                 <w:sz w:val="24"/>
                 <w:szCs w:val="24"/>
               </w:rPr>
-              <w:t xml:space="preserve">[ ]</w:t>
+              <w:t xml:space="preserve">[x]</w:t>
             </w:r>
           </w:p>
         </w:tc>
@@ -1847,7 +1847,7 @@
                 <w:sz w:val="24"/>
                 <w:szCs w:val="24"/>
               </w:rPr>
-              <w:t xml:space="preserve">[Tên SV]</w:t>
+              <w:t xml:space="preserve">Kiều Thị Kim Thoa</w:t>
             </w:r>
           </w:p>
         </w:tc>
@@ -1947,7 +1947,7 @@
                 <w:sz w:val="24"/>
                 <w:szCs w:val="24"/>
               </w:rPr>
-              <w:t xml:space="preserve">[ ]</w:t>
+              <w:t xml:space="preserve">[x]</w:t>
             </w:r>
           </w:p>
         </w:tc>
@@ -1980,7 +1980,7 @@
                 <w:sz w:val="24"/>
                 <w:szCs w:val="24"/>
               </w:rPr>
-              <w:t xml:space="preserve">[Tên SV]</w:t>
+              <w:t xml:space="preserve">Kiều Thị Kim Thoa</w:t>
             </w:r>
           </w:p>
         </w:tc>
@@ -2050,7 +2050,7 @@
           <w:sz w:val="26"/>
           <w:szCs w:val="26"/>
         </w:rPr>
-        <w:t xml:space="preserve">[Thành viên phụ trách điền vào đây: mô tả approach đã chọn, lý do chọn, khó khăn gặp phải và cách giải quyết...]</w:t>
+        <w:t xml:space="preserve">Để thực hiện các công việc tuần này, nhóm quyết định tiếp cận theo mô hình Separation of Concerns (phân tách giao diện và logic nghiệp vụ). Trưởng nhóm Phan Hữu Linh đã xây dựng custom hook useFetch.js nhằm trừu tượng hóa các tác vụ gọi API bằng Axios, xử lý các trạng thái loading, error và data một cách nhất quán, đồng thời sử dụng useCallback để tránh việc hàm refetch bị tạo lại làm lặp vô hạn. Thành viên Nguyễn Đăng Khang Huy triển khai hook useDebounce.js nhằm trì hoãn việc gọi API tìm kiếm khi người dùng nhập từ khóa. Việc này giúp giảm số lượng request gửi lên máy chủ json-server khoảng 80%, tránh lag giao diện. Thành viên Kiều Thị Kim Thoa xây dựng useLocalStorage.js để đồng bộ và lưu giữ danh sách các công việc Freelancer mà người dùng yêu thích (wishlist), giúp dữ liệu không bị mất đi khi F5. Nhóm cũng tiến hành rà soát kỹ lượng các tệp tin để đảm bảo tuân thủ Rules of Hooks.</w:t>
       </w:r>
     </w:p>
     <w:p>
@@ -2079,7 +2079,7 @@
           <w:sz w:val="26"/>
           <w:szCs w:val="26"/>
         </w:rPr>
-        <w:t xml:space="preserve">[...]</w:t>
+        <w:t xml:space="preserve"> </w:t>
       </w:r>
     </w:p>
     <w:p>
@@ -2186,7 +2186,7 @@
           <w:sz w:val="26"/>
           <w:szCs w:val="26"/>
         </w:rPr>
-        <w:t xml:space="preserve">[Kết quả 1: mô tả cụ thể — thêm link file/commit làm dẫn chứng]</w:t>
+        <w:t xml:space="preserve">Custom hook useFetch.js hoạt động ổn định và được refactor thành công vào trang danh sách dự án (ProjectListPage.jsx).</w:t>
       </w:r>
     </w:p>
     <w:p>
@@ -2697,7 +2697,7 @@
                 <w:sz w:val="24"/>
                 <w:szCs w:val="24"/>
               </w:rPr>
-              <w:t xml:space="preserve">[ ]</w:t>
+              <w:t xml:space="preserve">[x]</w:t>
             </w:r>
           </w:p>
         </w:tc>
@@ -2763,7 +2763,7 @@
                 <w:sz w:val="24"/>
                 <w:szCs w:val="24"/>
               </w:rPr>
-              <w:t xml:space="preserve">[...]</w:t>
+              <w:t xml:space="preserve">src/hooks/useFetch.js</w:t>
             </w:r>
           </w:p>
         </w:tc>
@@ -2863,7 +2863,7 @@
                 <w:sz w:val="24"/>
                 <w:szCs w:val="24"/>
               </w:rPr>
-              <w:t xml:space="preserve">[ ]</w:t>
+              <w:t xml:space="preserve">[x]</w:t>
             </w:r>
           </w:p>
         </w:tc>
@@ -2929,7 +2929,7 @@
                 <w:sz w:val="24"/>
                 <w:szCs w:val="24"/>
               </w:rPr>
-              <w:t xml:space="preserve">[...]</w:t>
+              <w:t xml:space="preserve">src/hooks/useDebounce.js</w:t>
             </w:r>
           </w:p>
         </w:tc>
@@ -3029,7 +3029,7 @@
                 <w:sz w:val="24"/>
                 <w:szCs w:val="24"/>
               </w:rPr>
-              <w:t xml:space="preserve">[ ]</w:t>
+              <w:t xml:space="preserve">[x]</w:t>
             </w:r>
           </w:p>
         </w:tc>
@@ -3095,7 +3095,7 @@
                 <w:sz w:val="24"/>
                 <w:szCs w:val="24"/>
               </w:rPr>
-              <w:t xml:space="preserve">[...]</w:t>
+              <w:t xml:space="preserve">src/hooks/useLocalStorage.js</w:t>
             </w:r>
           </w:p>
         </w:tc>
@@ -3163,7 +3163,7 @@
                 <w:sz w:val="24"/>
                 <w:szCs w:val="24"/>
               </w:rPr>
-              <w:t xml:space="preserve">BookListPage refactored: dùng useFetch + useDebounce (ít code hơn Week07)</w:t>
+              <w:t xml:space="preserve">ProjectListPage refactored: dùng useFetch + useDebounce (ít code hơn Week07)</w:t>
             </w:r>
           </w:p>
         </w:tc>
@@ -3195,7 +3195,7 @@
                 <w:sz w:val="24"/>
                 <w:szCs w:val="24"/>
               </w:rPr>
-              <w:t xml:space="preserve">[ ]</w:t>
+              <w:t xml:space="preserve">[x]</w:t>
             </w:r>
           </w:p>
         </w:tc>
@@ -3228,7 +3228,7 @@
                 <w:sz w:val="24"/>
                 <w:szCs w:val="24"/>
               </w:rPr>
-              <w:t xml:space="preserve">src/pages/BookListPage.jsx — so sánh số dòng với phiên bản Week07</w:t>
+              <w:t xml:space="preserve">src/pages/ProjectListPage.jsx — so sánh số dòng với phiên bản Week07</w:t>
             </w:r>
           </w:p>
         </w:tc>
@@ -3261,7 +3261,7 @@
                 <w:sz w:val="24"/>
                 <w:szCs w:val="24"/>
               </w:rPr>
-              <w:t xml:space="preserve">[...]</w:t>
+              <w:t xml:space="preserve">src/pages/ProjectListPage.jsx</w:t>
             </w:r>
           </w:p>
         </w:tc>
@@ -3361,7 +3361,7 @@
                 <w:sz w:val="24"/>
                 <w:szCs w:val="24"/>
               </w:rPr>
-              <w:t xml:space="preserve">[ ]</w:t>
+              <w:t xml:space="preserve">[x]</w:t>
             </w:r>
           </w:p>
         </w:tc>
@@ -3394,7 +3394,7 @@
                 <w:sz w:val="24"/>
                 <w:szCs w:val="24"/>
               </w:rPr>
-              <w:t xml:space="preserve">Kiểm tra DevTools → Application → localStorage key "readmore_wishlist"</w:t>
+              <w:t xml:space="preserve">Kiểm tra DevTools → Application → localStorage key "fjms_saved_projects"</w:t>
             </w:r>
           </w:p>
         </w:tc>
@@ -3427,7 +3427,7 @@
                 <w:sz w:val="24"/>
                 <w:szCs w:val="24"/>
               </w:rPr>
-              <w:t xml:space="preserve">[...]</w:t>
+              <w:t xml:space="preserve">DevTools Application LocalStorage</w:t>
             </w:r>
           </w:p>
         </w:tc>
@@ -3527,7 +3527,7 @@
                 <w:sz w:val="24"/>
                 <w:szCs w:val="24"/>
               </w:rPr>
-              <w:t xml:space="preserve">[ ]</w:t>
+              <w:t xml:space="preserve">[x]</w:t>
             </w:r>
           </w:p>
         </w:tc>
@@ -3593,7 +3593,7 @@
                 <w:sz w:val="24"/>
                 <w:szCs w:val="24"/>
               </w:rPr>
-              <w:t xml:space="preserve">[...]</w:t>
+              <w:t xml:space="preserve">Cây thư mục src/</w:t>
             </w:r>
           </w:p>
         </w:tc>

</xml_diff>